<commit_message>
Insere seções 4.1 e 8.2 no corpo do Manual (estavam presas no Sumário)
- 4.1 Fundamentos da diferenciação de regimes (4.1.1–4.1.6): inserida após
  a tabela de regimes de conversão, antes da seção 5 (Natureza)
- 8.2 Fundamentos teóricos das circunstâncias agravantes e atenuantes
  (8.2.1–8.2.5): inserida após 8.1 Limites, antes das listas de agravantes
- Antigas 8.2.1/8.2.2 renumeradas para 8.3/8.4

https://claude.ai/code/session_01HyfJBH68rzsxSW5gUr86Cc
</commit_message>
<xml_diff>
--- a/Manual_Calculadora_Dosimetria_TAC_v1.docx
+++ b/Manual_Calculadora_Dosimetria_TAC_v1.docx
@@ -2861,7 +2861,7 @@
                 <w:rStyle w:val="Hyperlink"/>
                 <w:noProof/>
               </w:rPr>
-              <w:t>8.2.1 Agravantes (7 itens)</w:t>
+              <w:t>8.3 Agravantes (7 itens)</w:t>
             </w:r>
             <w:r>
               <w:rPr>
@@ -2893,7 +2893,7 @@
                 <w:rStyle w:val="Hyperlink"/>
                 <w:noProof/>
               </w:rPr>
-              <w:t>8.2.2 Atenuantes (13 itens)</w:t>
+              <w:t>8.4 Atenuantes (13 itens)</w:t>
             </w:r>
             <w:r>
               <w:rPr>
@@ -10138,6 +10138,152 @@
         <w:t>PARTE III — ANÁLISE JURÍDICA DOS ELEMENTOS</w:t>
       </w:r>
     </w:p>
+    <w:p>
+      <w:pPr>
+        <w:pStyle w:val="Ttulo2"/>
+      </w:pPr>
+      <w:r>
+        <w:t>4.1 Fundamentos da diferenciação de regimes</w:t>
+      </w:r>
+    </w:p>
+    <w:p>
+      <w:pPr>
+        <w:pStyle w:val="Ttulo3"/>
+      </w:pPr>
+      <w:r>
+        <w:t>4.1.1 O problema da conversão uniforme</w:t>
+      </w:r>
+    </w:p>
+    <w:p>
+      <w:pPr>
+        <w:spacing w:before="80" w:after="80" w:line="276" w:lineRule="auto"/>
+        <w:jc w:val="both"/>
+      </w:pPr>
+      <w:r>
+        <w:t xml:space="preserve">A pontuação produzida pela primeira fase da Calculadora é uma grandeza abstrata: expressa o grau de reprovabilidade da conduta na escala interna do sistema, mas não se converte automaticamente em penalidade. A conversão — o mecanismo que transforma pontos em advertência ou dias de suspensão — é etapa distinta, sujeita a uma variável que a primeira fase não capta: o regime punitivo específico ao qual a infração está submetida.</w:t>
+      </w:r>
+    </w:p>
+    <w:p/>
+    <w:p>
+      <w:pPr>
+        <w:spacing w:before="80" w:after="80" w:line="276" w:lineRule="auto"/>
+        <w:jc w:val="both"/>
+      </w:pPr>
+      <w:r>
+        <w:t xml:space="preserve">Se a conversão fosse uniforme para todas as infrações, condutas com idêntica pontuação resultariam sempre na mesma penalidade, independentemente do dispositivo violado. Essa aparente isonomia seria, na verdade, uma isonomia formal que ignora desigualdades materiais relevantes: o legislador, em determinadas hipóteses, já realizou seu próprio juízo de maior reprovabilidade ao excluir a advertência como resposta possível. Aplicar a essas hipóteses a mesma fórmula de conversão das infrações ordinárias seria, paradoxalmente, tratar de forma igual situações que o próprio ordenamento tratou de forma diferente. Os regimes de conversão operacionalizam, portanto, uma diferenciação que não vem da Calculadora — vem da lei.</w:t>
+      </w:r>
+    </w:p>
+    <w:p/>
+    <w:p>
+      <w:pPr>
+        <w:pStyle w:val="Ttulo3"/>
+      </w:pPr>
+      <w:r>
+        <w:t>4.1.2 A estrutura constitucional da diferenciação</w:t>
+      </w:r>
+    </w:p>
+    <w:p>
+      <w:pPr>
+        <w:spacing w:before="80" w:after="80" w:line="276" w:lineRule="auto"/>
+        <w:jc w:val="both"/>
+      </w:pPr>
+      <w:r>
+        <w:t xml:space="preserve">A legalidade em matéria sancionadora (art. 5º, XXXIX, da Constituição Federal; art. 37, caput) impõe que as condições de aplicação de qualquer penalidade estejam fixadas em lei. Quando o legislador estabelece, para determinadas infrações, que a penalidade mínima é a suspensão — vedando expressamente a advertência —, está exercendo a prerrogativa exclusiva de graduar a priori a resposta estatal a categorias de conduta que considerou mais graves. Os regimes especiais são, nesse sentido, uma exigência de dupla legalidade: nem menos punitivos do que a lei determina, nem mais.</w:t>
+      </w:r>
+    </w:p>
+    <w:p/>
+    <w:p>
+      <w:pPr>
+        <w:pStyle w:val="Ttulo3"/>
+      </w:pPr>
+      <w:r>
+        <w:t>4.1.3 Regime Geral — a referência de base</w:t>
+      </w:r>
+    </w:p>
+    <w:p>
+      <w:pPr>
+        <w:spacing w:before="80" w:after="80" w:line="276" w:lineRule="auto"/>
+        <w:jc w:val="both"/>
+      </w:pPr>
+      <w:r>
+        <w:t xml:space="preserve">O Regime Geral aplica-se às infrações que comportam tanto advertência quanto suspensão — o espectro completo de penalidades previsto pelos arts. 129 e 130 da Lei nº 8.112/90. É o regime de maior plasticidade. O ponto de corte em 30 pontos representa o limiar a partir do qual a reprovabilidade acumulada justifica a passagem da penalidade mais branda (advertência) para a mais gravosa (suspensão). Abaixo dele, a resposta proporcional é o registro formal; acima dele, a restrição temporária do exercício funcional.</w:t>
+      </w:r>
+    </w:p>
+    <w:p/>
+    <w:p>
+      <w:pPr>
+        <w:pStyle w:val="Ttulo3"/>
+      </w:pPr>
+      <w:r>
+        <w:t>4.1.4 Regimes Especiais — o juízo legislativo de gravidade qualificada</w:t>
+      </w:r>
+    </w:p>
+    <w:p>
+      <w:pPr>
+        <w:spacing w:before="80" w:after="80" w:line="276" w:lineRule="auto"/>
+        <w:jc w:val="both"/>
+      </w:pPr>
+      <w:r>
+        <w:t xml:space="preserve">RE1 — Art. 117, XVII e XVIII da Lei nº 8.112/90. Os incisos XVII (cometer a outro servidor atribuições estranhas ao cargo) e XVIII (exercer atividades incompatíveis com o exercício do cargo) estão sujeitos somente à suspensão, que pode variar de 1 a 90 dias (art. 130, caput). Ao prever suspensão — e não advertência —, o legislador emitiu sinal inequívoco: a reprovabilidade mínima dessas condutas já supera o patamar que autoriza a penalidade mais branda. O regime RE1 operacionaliza esse sinal: qualquer pontuação, mesmo a mais baixa, converte-se em suspensão, não em advertência.</w:t>
+      </w:r>
+    </w:p>
+    <w:p/>
+    <w:p>
+      <w:pPr>
+        <w:spacing w:before="80" w:after="80" w:line="276" w:lineRule="auto"/>
+        <w:jc w:val="both"/>
+      </w:pPr>
+      <w:r>
+        <w:t xml:space="preserve">RE2 — Art. 130, §1º (recusa de inspeção médica). A recusa de submissão à inspeção médica determinada pela autoridade competente recebe tratamento autônomo: suspensão de até 15 dias. O teto reduzido (15 dias, não 90) revela que o legislador quis uma resposta proporcionalmente mais contida — mas ainda assim necessariamente suspensiva.</w:t>
+      </w:r>
+    </w:p>
+    <w:p/>
+    <w:p>
+      <w:pPr>
+        <w:spacing w:before="80" w:after="80" w:line="276" w:lineRule="auto"/>
+        <w:jc w:val="both"/>
+      </w:pPr>
+      <w:r>
+        <w:t xml:space="preserve">RE3 — Art. 32 da Lei nº 12.527/2011 (LAI). A Lei de Acesso à Informação tipificou infrações funcionais autônomas, cominando suspensão de 1 a 90 dias (art. 32, §2º). Ao excluir a advertência, o legislador da LAI fez escolha expressa de maior severidade. O fundamento complementar é constitucional: a LAI tutela o direito fundamental de acesso à informação pública (art. 5º, XXXIII, e art. 37, §3º, II, da Constituição), cujo núcleo essencial merece proteção autônoma, não diluída na lógica residual do Regime Geral.</w:t>
+      </w:r>
+    </w:p>
+    <w:p/>
+    <w:p>
+      <w:pPr>
+        <w:pStyle w:val="Ttulo3"/>
+      </w:pPr>
+      <w:r>
+        <w:t>4.1.5 O regime de Concurso Material — regra de consolidação, não de conversão</w:t>
+      </w:r>
+    </w:p>
+    <w:p>
+      <w:pPr>
+        <w:spacing w:before="80" w:after="80" w:line="276" w:lineRule="auto"/>
+        <w:jc w:val="both"/>
+      </w:pPr>
+      <w:r>
+        <w:t xml:space="preserve">O Concurso Material de Infrações não constitui, em sentido estrito, um quinto regime de conversão: é uma regra de consolidação de resultados. Cada infração em concurso percorre seu próprio regime individualmente, gerando sua própria penalidade parcial. A consolidação ocorre em momento posterior, segundo as regras do item 11 deste Manual. Tratar o Concurso como um "regime diferente" seria metodologicamente incorreto e poderia sugerir, erroneamente, que a pontuação dos elementos se mistura entre as infrações. Cada ciclo é independente; a consolidação é aritmética.</w:t>
+      </w:r>
+    </w:p>
+    <w:p/>
+    <w:p>
+      <w:pPr>
+        <w:pStyle w:val="Ttulo3"/>
+      </w:pPr>
+      <w:r>
+        <w:t>4.1.6 Isonomia material e diferenciação de regimes</w:t>
+      </w:r>
+    </w:p>
+    <w:p>
+      <w:pPr>
+        <w:spacing w:before="80" w:after="80" w:line="276" w:lineRule="auto"/>
+        <w:jc w:val="both"/>
+      </w:pPr>
+      <w:r>
+        <w:t xml:space="preserve">A diferenciação de regimes não viola a isonomia — pressupõe-na em sua dimensão material. A isonomia material exige que a resposta do sistema seja proporcional às distinções que o próprio ordenamento reconheceu como juridicamente relevantes. Quando o legislador distinguiu, o intérprete não pode nivelar. Os regimes especiais garantem que o servidor que viola norma de regime qualificado não se beneficie da mesma escala de conversão daquele que viola norma ordinária — e, simetricamente, que o servidor em regime de teto reduzido (RE2) não seja submetido à escala de um regime mais gravoso.</w:t>
+      </w:r>
+    </w:p>
+    <w:p/>
     <w:p>
       <w:pPr>
         <w:pStyle w:val="Ttulo1"/>
@@ -15150,9 +15296,297 @@
       <w:pPr>
         <w:pStyle w:val="Ttulo2"/>
       </w:pPr>
+      <w:r>
+        <w:t>8.2 Fundamentos teóricos das circunstâncias agravantes e atenuantes</w:t>
+      </w:r>
+    </w:p>
+    <w:p>
+      <w:pPr>
+        <w:pStyle w:val="Ttulo3"/>
+      </w:pPr>
+      <w:r>
+        <w:t>8.2.1 A função dogmática das circunstâncias</w:t>
+      </w:r>
+    </w:p>
+    <w:p>
+      <w:pPr>
+        <w:spacing w:before="80" w:after="80" w:line="276" w:lineRule="auto"/>
+        <w:jc w:val="both"/>
+      </w:pPr>
+      <w:r>
+        <w:t xml:space="preserve">As circunstâncias não descrevem o ilícito: o circundam. Essa posição periférica tem consequência direta sobre sua função na dosimetria: não constroem a reprovação, modulam-na. A lei não as define; o art. 128 apenas as menciona como critério a considerar, delegando ao aplicador a tarefa de identificá-las e ponderá-las em cada caso concreto. A Calculadora operacionaliza essa abertura por meio de um catálogo fechado de itens acompanhados de sliders de intensidade. O catálogo fecha o espaço de escolha — reduzindo a arbitrariedade na identificação das circunstâncias relevantes —; os sliders preservam o espaço de graduação — reconhecendo que a mesma circunstância pode ter intensidade muito diferente de caso para caso.</w:t>
+      </w:r>
+    </w:p>
+    <w:p/>
+    <w:p>
+      <w:pPr>
+        <w:pStyle w:val="Ttulo3"/>
+      </w:pPr>
+      <w:r>
+        <w:t>8.2.2 Limites gerais das circunstâncias</w:t>
+      </w:r>
+    </w:p>
+    <w:p>
+      <w:pPr>
+        <w:spacing w:before="80" w:after="80" w:line="276" w:lineRule="auto"/>
+        <w:jc w:val="both"/>
+      </w:pPr>
+      <w:r>
+        <w:t xml:space="preserve">Primeiro limite — vedação à dupla valoração. Nenhuma circunstância pode valorar fato ou dado que já integrou a pontuação de outro elemento. A Súmula 241 do STJ exprime, no plano penal, princípio de validade geral para todo o direito sancionador. Na Calculadora, o risco mais frequente é pontuar como agravante contextual um fato que já compôs SF2.1 (hierarquia da norma) ou o dano: a posição de chefia, por exemplo, já eleva SF2.1 quando a norma violada protege bens sob custódia do chefe — não pode reaparecer como agravante circunstancial pelo mesmo motivo.</w:t>
+      </w:r>
+    </w:p>
+    <w:p/>
+    <w:p>
+      <w:pPr>
+        <w:spacing w:before="80" w:after="80" w:line="276" w:lineRule="auto"/>
+        <w:jc w:val="both"/>
+      </w:pPr>
+      <w:r>
+        <w:t xml:space="preserve">Segundo limite — vedação à conversão em pena capital. O art. 128 restringe-se ao intervalo advertência–suspensão. As circunstâncias não podem, por mais graves que sejam, transformar a infração em caso de demissão. Seu papel é mover a penalidade dentro do intervalo legal, não deslocar o enquadramento para fora dele.</w:t>
+      </w:r>
+    </w:p>
+    <w:p/>
+    <w:p>
+      <w:pPr>
+        <w:pStyle w:val="Ttulo3"/>
+      </w:pPr>
+      <w:r>
+        <w:t>8.2.3 Fundamentos dos agravantes</w:t>
+      </w:r>
+    </w:p>
+    <w:p>
+      <w:pPr>
+        <w:spacing w:before="80" w:after="80" w:line="276" w:lineRule="auto"/>
+        <w:jc w:val="both"/>
+      </w:pPr>
+      <w:r>
+        <w:t xml:space="preserve">AG1 — Alta qualificação ou capacitação técnica na área do ilícito. O fundamento é o princípio da culpabilidade em sua dimensão de exigibilidade: exige-se mais de quem pode mais. Quem detém conhecimento especializado na área em que cometeu a infração tinha maior capacidade de perceber a irregularidade e de evitá-la — o que eleva o grau de censurabilidade da conduta sem alterar seu elemento subjetivo. O art. 22 da LINDB confirma a lógica ao reconhecer a relevância das "condições reais" do agente.</w:t>
+      </w:r>
+    </w:p>
+    <w:p/>
+    <w:p>
+      <w:pPr>
+        <w:spacing w:before="80" w:after="80" w:line="276" w:lineRule="auto"/>
+        <w:jc w:val="both"/>
+      </w:pPr>
+      <w:r>
+        <w:t xml:space="preserve">AG2 — Exercício de cargo em comissão ou função gratificada na área do ilícito. A posição hierárquica superior implica deveres funcionais reforçados: dever de supervisão, de controle, de dar o exemplo institucional. O fundamento normativo direto é o art. 116, III e XI, combinado com os arts. 13 e 14 da Lei nº 8.112/90. A jurisprudência do STJ reconhece que a posição hierárquica pode agravar a reprovação sem configurar bis in idem, desde que o que se valora seja o dever especial — não o dano.</w:t>
+      </w:r>
+    </w:p>
+    <w:p/>
+    <w:p>
+      <w:pPr>
+        <w:spacing w:before="80" w:after="80" w:line="276" w:lineRule="auto"/>
+        <w:jc w:val="both"/>
+      </w:pPr>
+      <w:r>
+        <w:t xml:space="preserve">AG3 — Premeditação ou planejamento verificável. A premeditação distingue a conduta impulsiva da deliberada: quem planeja tem tempo para reconsiderar, buscar orientação ou comunicar a dificuldade à chefia. A ausência dessas providências, quando havia tempo e oportunidade para tomá-las, revela uma escolha — e escolhas deliberadas são mais censuráveis do que reações imediatas. No direito penal, a premeditação é agravante clássico (art. 61, II, a, do Código Penal); no direito disciplinar, sua incidência decorre dos princípios gerais do direito sancionador.</w:t>
+      </w:r>
+    </w:p>
+    <w:p/>
+    <w:p>
+      <w:pPr>
+        <w:spacing w:before="80" w:after="80" w:line="276" w:lineRule="auto"/>
+        <w:jc w:val="both"/>
+      </w:pPr>
+      <w:r>
+        <w:t xml:space="preserve">AG4 — Cometimento por motivo fútil ou de baixa relevância. O motivo fútil revela especial censurabilidade: o agente violou norma relevante por razão desproporcional à gravidade da infração — sinal de que a proteção do bem jurídico foi conscientemente desconsiderada em favor de interesse de ínfimo valor. A futilidade do motivo não altera o dolo já pontuado em SF1.1, mas aumenta a reprovabilidade da escolha dolosa.</w:t>
+      </w:r>
+    </w:p>
+    <w:p/>
+    <w:p>
+      <w:pPr>
+        <w:spacing w:before="80" w:after="80" w:line="276" w:lineRule="auto"/>
+        <w:jc w:val="both"/>
+      </w:pPr>
+      <w:r>
+        <w:t xml:space="preserve">AG5 — Reiteração da conduta durante o mesmo período apurado (sem continuidade delitiva). Difere da infração continuada (captada em SF2.2) porque aqui não há unidade de desígnio nem modus operandi único: são condutas repetidas por descuido sistemático ou indiferença reiterada, que demonstra padrão de desatenção que excede o desvio pontual e merece valoração adicional.</w:t>
+      </w:r>
+    </w:p>
+    <w:p/>
+    <w:p>
+      <w:pPr>
+        <w:spacing w:before="80" w:after="80" w:line="276" w:lineRule="auto"/>
+        <w:jc w:val="both"/>
+      </w:pPr>
+      <w:r>
+        <w:t xml:space="preserve">AG6 — Tentativa de ocultação da irregularidade ou de obstaculização da apuração. Conduta posterior ao ilícito que revela persistência na violação. No plano subjetivo, confirma a consciência da ilicitude; no plano objetivo, causa dano autônomo à regularidade do procedimento disciplinar, que é bem jurídico distinto do bem tutelado pela norma violada.</w:t>
+      </w:r>
+    </w:p>
+    <w:p/>
+    <w:p>
+      <w:pPr>
+        <w:spacing w:before="80" w:after="80" w:line="276" w:lineRule="auto"/>
+        <w:jc w:val="both"/>
+      </w:pPr>
+      <w:r>
+        <w:t xml:space="preserve">AG7 — Ausência de qualquer providência reparatória, quando possível. O agente que poderia reparar o dano e deliberadamente não o fez demonstra indiferença persistente às consequências de sua conduta. O fundamento é o princípio da boa-fé objetiva nas relações funcionais (art. 116, IX, da Lei nº 8.112/90 — manter conduta compatível com a moralidade administrativa).</w:t>
+      </w:r>
+    </w:p>
+    <w:p/>
+    <w:p>
+      <w:pPr>
+        <w:pStyle w:val="Ttulo3"/>
+      </w:pPr>
+      <w:r>
+        <w:t>8.2.4 Fundamentos dos atenuantes</w:t>
+      </w:r>
+    </w:p>
+    <w:p>
+      <w:pPr>
+        <w:spacing w:before="80" w:after="80" w:line="276" w:lineRule="auto"/>
+        <w:jc w:val="both"/>
+      </w:pPr>
+      <w:r>
+        <w:t xml:space="preserve">AT1 — Confissão espontânea antes da instauração formal do processo. O fundamento é duplo: no plano processual, colabora com a instrução; no plano material, revela postura de accountability funcional. A analogia com o art. 65, III, d, do Código Penal é expressamente admitida pela doutrina administrativista por força dos princípios gerais do direito sancionador. O limite é a espontaneidade: confissão após o início formal da apuração não configura este atenuante.</w:t>
+      </w:r>
+    </w:p>
+    <w:p/>
+    <w:p>
+      <w:pPr>
+        <w:spacing w:before="80" w:after="80" w:line="276" w:lineRule="auto"/>
+        <w:jc w:val="both"/>
+      </w:pPr>
+      <w:r>
+        <w:t xml:space="preserve">AT2 — Reparação voluntária do dano antes do julgamento. A reparação voluntária não extingue a punibilidade, mas reduz o desvalor do resultado considerado ao momento do julgamento. Fundamento normativo: art. 65, III, b, do Código Penal, aplicado por analogia; e art. 128 da Lei nº 8.112/90 lido em conjunto com o princípio da proporcionalidade.</w:t>
+      </w:r>
+    </w:p>
+    <w:p/>
+    <w:p>
+      <w:pPr>
+        <w:spacing w:before="80" w:after="80" w:line="276" w:lineRule="auto"/>
+        <w:jc w:val="both"/>
+      </w:pPr>
+      <w:r>
+        <w:t xml:space="preserve">AT3 — Falta de treinamento ou capacitação documentada na área do ilícito. A base normativa direta é o art. 22 da LINDB: "Na interpretação de normas sobre gestão pública, serão considerados os obstáculos e as dificuldades reais do gestor". A ausência de capacitação adequada é, inequivocamente, um obstáculo real. O fundamento complementar é o princípio da culpabilidade na dimensão da exigibilidade de conduta diversa. Condição de aplicação: a falta de capacitação precisa ser documentada nos autos.</w:t>
+      </w:r>
+    </w:p>
+    <w:p/>
+    <w:p>
+      <w:pPr>
+        <w:spacing w:before="80" w:after="80" w:line="276" w:lineRule="auto"/>
+        <w:jc w:val="both"/>
+      </w:pPr>
+      <w:r>
+        <w:t xml:space="preserve">AT4 — Pressão institucional documentada ou sobrecarga operacional verificável. O art. 22 da LINDB é o âncora principal: "exigências das políticas públicas a seu cargo" e "obstáculos e dificuldades reais" incluem o contexto operacional. Fundamento complementar: a teoria das causas supralegais de exculpação (inexigibilidade de conduta diversa). Condição inegociável: a pressão ou sobrecarga deve ser verificável objetivamente nos autos — registros de pessoal, volume de processos, determinações hierárquicas documentadas.</w:t>
+      </w:r>
+    </w:p>
+    <w:p/>
+    <w:p>
+      <w:pPr>
+        <w:spacing w:before="80" w:after="80" w:line="276" w:lineRule="auto"/>
+        <w:jc w:val="both"/>
+      </w:pPr>
+      <w:r>
+        <w:t xml:space="preserve">AT5 — Pouco tempo no exercício da função específica. O fundamento é a curva de aprendizado funcional: toda atribuição tem um período de adaptação em que a exigibilidade de conduta diversa é legitimamente menor. Deve-se verificar não apenas o tempo de serviço no órgão, mas o tempo efetivo no exercício daquela função específica — um servidor com vinte anos de carreira pode ser principiante numa atribuição nova.</w:t>
+      </w:r>
+    </w:p>
+    <w:p/>
+    <w:p>
+      <w:pPr>
+        <w:spacing w:before="80" w:after="80" w:line="276" w:lineRule="auto"/>
+        <w:jc w:val="both"/>
+      </w:pPr>
+      <w:r>
+        <w:t xml:space="preserve">AT6 — Colaboração efetiva com a apuração. Distinta da confissão (AT1), a colaboração efetiva engloba auxílio ativo na instrução: fornecimento voluntário de documentos, indicação de testemunhas, elucidação de contextos que a comissão não alcançaria por seus próprios meios.</w:t>
+      </w:r>
+    </w:p>
+    <w:p/>
+    <w:p>
+      <w:pPr>
+        <w:spacing w:before="80" w:after="80" w:line="276" w:lineRule="auto"/>
+        <w:jc w:val="both"/>
+      </w:pPr>
+      <w:r>
+        <w:t xml:space="preserve">AT7 — Arrependimento posterior demonstrado por ações concretas. O arrependimento relevante para a dosimetria não é o declarado, mas o demonstrado por ações: comunicação espontânea à chefia, adoção de providências para evitar reincidência. Condição: as ações devem ser anteriores ao início formal da apuração ou independentes dela.</w:t>
+      </w:r>
+    </w:p>
+    <w:p/>
+    <w:p>
+      <w:pPr>
+        <w:spacing w:before="80" w:after="80" w:line="276" w:lineRule="auto"/>
+        <w:jc w:val="both"/>
+      </w:pPr>
+      <w:r>
+        <w:t xml:space="preserve">AT8 — Ausência de benefício pessoal da conduta. Este atenuante só tem relevância autônoma em condutas dolosas. Em condutas culposas, a ausência de benefício é inerente à própria natureza da culpa e não acrescenta nada à mitigação já expressa pela natureza da infração.</w:t>
+      </w:r>
+    </w:p>
+    <w:p/>
+    <w:p>
+      <w:pPr>
+        <w:spacing w:before="80" w:after="80" w:line="276" w:lineRule="auto"/>
+        <w:jc w:val="both"/>
+      </w:pPr>
+      <w:r>
+        <w:t xml:space="preserve">AT9 — Existência de normas internas contraditórias ou ambíguas. Quando normas internas apresentam redação contraditória, o servidor que escolheu uma das interpretações possíveis — ainda que a escolhida fosse a incorreta — não pode ser censurado com a mesma intensidade de quem violou norma clara. O art. 22 da LINDB é relevante: a ambiguidade normativa é um obstáculo real que o próprio órgão criou. A contradição deve ser demonstrável no texto das normas.</w:t>
+      </w:r>
+    </w:p>
+    <w:p/>
+    <w:p>
+      <w:pPr>
+        <w:spacing w:before="80" w:after="80" w:line="276" w:lineRule="auto"/>
+        <w:jc w:val="both"/>
+      </w:pPr>
+      <w:r>
+        <w:t xml:space="preserve">AT10 — Inexistência de orientação formal prévia sobre a conduta esperada. Distinto do AT3 (capacitação técnica) e do AT9 (ambiguidade normativa), capta a lacuna de orientação: há norma clara, o servidor tem capacidade técnica, mas o órgão nunca forneceu orientação formal explícita sobre como aplicá-la naquele contexto específico. O fundamento é o art. 22 da LINDB e o dever da Administração de fornecer ao servidor as condições para o correto desempenho de suas funções.</w:t>
+      </w:r>
+    </w:p>
+    <w:p/>
+    <w:p>
+      <w:pPr>
+        <w:spacing w:before="80" w:after="80" w:line="276" w:lineRule="auto"/>
+        <w:jc w:val="both"/>
+      </w:pPr>
+      <w:r>
+        <w:t xml:space="preserve">AT11 — Ato isolado em longo histórico de conformidade. O fundamento é o princípio da culpabilidade pelo fato em sua dimensão longitudinal: quando o servidor tem longo histórico de conformidade funcional e comete uma única irregularidade, o peso relativo desse ato no conjunto de sua trajetória é menor. Não se confunde com os bons antecedentes (elemento autônomo do art. 128): os bons antecedentes valoram registros formais abonatórios; este atenuante valoriza a ausência de irregularidades — a trajetória de conformidade, mesmo sem elogios formais.</w:t>
+      </w:r>
+    </w:p>
+    <w:p/>
+    <w:p>
+      <w:pPr>
+        <w:spacing w:before="80" w:after="80" w:line="276" w:lineRule="auto"/>
+        <w:jc w:val="both"/>
+      </w:pPr>
+      <w:r>
+        <w:t xml:space="preserve">AT12 — Contexto de crise, emergência ou situação excepcional documentada. Enquanto AT4 trata de pressão estrutural crônica, AT12 trata de situação excepcional e temporária — crises institucionais, emergências sanitárias, reestruturações abruptas — que nenhum planejamento individual poderia ter antecipado. O fundamento é o art. 22 da LINDB. A situação excepcional deve ser documentada institucionalmente.</w:t>
+      </w:r>
+    </w:p>
+    <w:p/>
+    <w:p>
+      <w:pPr>
+        <w:spacing w:before="80" w:after="80" w:line="276" w:lineRule="auto"/>
+        <w:jc w:val="both"/>
+      </w:pPr>
+      <w:r>
+        <w:t xml:space="preserve">AT13 — Baixo grau de autonomia decisória na conduta. Quem age sob instrução direta de superior hierárquico, sem margem real de recusa, tem sua culpabilidade reduzida pela limitação da liberdade decisória. Fundamento: art. 116, IV, da Lei nº 8.112/90 lido em sua dimensão atenuante. Limite fundamental: este atenuante não se aplica quando a ordem era manifestamente ilegal.</w:t>
+      </w:r>
+    </w:p>
+    <w:p/>
+    <w:p>
+      <w:pPr>
+        <w:pStyle w:val="Ttulo3"/>
+      </w:pPr>
+      <w:r>
+        <w:t>8.2.5 A exigência de comprovação: circunstâncias não se presumem</w:t>
+      </w:r>
+    </w:p>
+    <w:p>
+      <w:pPr>
+        <w:spacing w:before="80" w:after="80" w:line="276" w:lineRule="auto"/>
+        <w:jc w:val="both"/>
+      </w:pPr>
+      <w:r>
+        <w:t xml:space="preserve">A regra transversal a todos os itens do catálogo — agravantes e atenuantes — é que circunstâncias não se presumem. Devem estar demonstradas nos autos por elementos probatórios concretos: documentos, registros, depoimentos, certificados, escalas, determinações hierárquicas. A mera alegação não é suficiente. Essa exigência tem fundamento constitucional (presunção de inocência; art. 5º, LVII) e legal (art. 2º, XII, da Lei nº 9.784/1999). O campo de complementação obrigatória na Calculadora, associado a cada item marcado, serve exatamente a esse propósito: forçar o operador a registrar o fundamento probatório no mesmo momento da escolha.</w:t>
+      </w:r>
+    </w:p>
+    <w:p/>
+    <w:p>
+      <w:pPr>
+        <w:pStyle w:val="Ttulo2"/>
+      </w:pPr>
       <w:bookmarkStart w:id="42" w:name="_Toc232175887"/>
       <w:r>
-        <w:t>8.2.1 Agravantes (7 itens)</w:t>
+        <w:t>8.3 Agravantes (7 itens)</w:t>
       </w:r>
       <w:bookmarkEnd w:id="42"/>
     </w:p>
@@ -16753,7 +17187,7 @@
       </w:pPr>
       <w:bookmarkStart w:id="43" w:name="_Toc232175888"/>
       <w:r>
-        <w:t>8.2.2 Atenuantes (13 itens)</w:t>
+        <w:t>8.4 Atenuantes (13 itens)</w:t>
       </w:r>
       <w:bookmarkEnd w:id="43"/>
     </w:p>

</xml_diff>